<commit_message>
dino grounding layer and optimizations
</commit_message>
<xml_diff>
--- a/docs/ОКО_документация.docx
+++ b/docs/ОКО_документация.docx
@@ -649,7 +649,7 @@
                 <w:sz w:val="18"/>
                 <w:szCs w:val="18"/>
               </w:rPr>
-              <w:t xml:space="preserve">Сервис: FastAPI, движок правил, детекторы, ИИ-анализ, модель данных, консоль, 71 автотест, Dockerfile</w:t>
+              <w:t xml:space="preserve">Сервис: FastAPI, движок правил, детекторы, ИИ-анализ, модель данных, консоль, 82 автотеста, Dockerfile</w:t>
             </w:r>
           </w:p>
         </w:tc>
@@ -2259,7 +2259,7 @@
         <w:rPr>
           <w:rFonts w:ascii="Arial" w:cs="Arial" w:eastAsia="Arial" w:hAnsi="Arial"/>
         </w:rPr>
-        <w:t xml:space="preserve"> Машина относится к зоне по точке опоры — середине нижней стороны рамки; башенный кран обслуживает всю площадку.</w:t>
+        <w:t xml:space="preserve"> Машина относится к зоне по точке опоры — середине нижней стороны рамки в полигоне зоны, размеченном для камеры; башенный кран обслуживает всю площадку. Снимок с другого ракурса загружается в режиме «весь кадр → зона»: полигоны не применяются.</w:t>
       </w:r>
     </w:p>
     <w:p>
@@ -7765,7 +7765,7 @@
                 <w:sz w:val="17"/>
                 <w:szCs w:val="17"/>
               </w:rPr>
-              <w:t xml:space="preserve">Локальная VLM</w:t>
+              <w:t xml:space="preserve">Grounding DINO</w:t>
             </w:r>
           </w:p>
         </w:tc>
@@ -7791,7 +7791,7 @@
                 <w:sz w:val="17"/>
                 <w:szCs w:val="17"/>
               </w:rPr>
-              <w:t xml:space="preserve">Описание сцены, техника с рамками, стадия, люди, условия съёмки</w:t>
+              <w:t xml:space="preserve">Как в ML-части: прочие объекты по текстовым подсказкам — рабочие, леса, опалубка, строящееся здание, котлован, ограждение; техника одним запросом — подтверждение рамок RF-DETR и кандидаты в пропущенную технику</w:t>
             </w:r>
           </w:p>
         </w:tc>
@@ -7817,7 +7817,7 @@
                 <w:sz w:val="17"/>
                 <w:szCs w:val="17"/>
               </w:rPr>
-              <w:t xml:space="preserve">Qwen3-VL 8B → 4B → 2B → SmolVLM2-500M: самая крупная, что помещается в память</w:t>
+              <w:t xml:space="preserve">сервис, CPU; подсказки — methodology/open_vocab.yaml</w:t>
             </w:r>
           </w:p>
         </w:tc>
@@ -7849,7 +7849,7 @@
                 <w:sz w:val="17"/>
                 <w:szCs w:val="17"/>
               </w:rPr>
-              <w:t xml:space="preserve">Сверка детектора и VLM</w:t>
+              <w:t xml:space="preserve">Локальная VLM</w:t>
             </w:r>
           </w:p>
         </w:tc>
@@ -7876,7 +7876,7 @@
                 <w:sz w:val="17"/>
                 <w:szCs w:val="17"/>
               </w:rPr>
-              <w:t xml:space="preserve">По IoU рамок: совпали, спорный класс, только VLM, только детектор</w:t>
+              <w:t xml:space="preserve">Описание сцены, техника с рамками, стадия, люди, условия съёмки</w:t>
             </w:r>
           </w:p>
         </w:tc>
@@ -7903,7 +7903,7 @@
                 <w:sz w:val="17"/>
                 <w:szCs w:val="17"/>
               </w:rPr>
-              <w:t xml:space="preserve">сервис</w:t>
+              <w:t xml:space="preserve">Qwen3-VL 8B → 4B → 2B → SmolVLM2-500M: самая крупная, что помещается в память</w:t>
             </w:r>
           </w:p>
         </w:tc>
@@ -7934,6 +7934,90 @@
                 <w:sz w:val="17"/>
                 <w:szCs w:val="17"/>
               </w:rPr>
+              <w:t xml:space="preserve">Сверка детектора и VLM</w:t>
+            </w:r>
+          </w:p>
+        </w:tc>
+        <w:tc>
+          <w:tcPr>
+            <w:tcW w:type="dxa" w:w="4819"/>
+            <w:tcMar>
+              <w:top w:type="dxa" w:w="60"/>
+              <w:left w:type="dxa" w:w="90"/>
+              <w:bottom w:type="dxa" w:w="60"/>
+              <w:right w:type="dxa" w:w="90"/>
+            </w:tcMar>
+          </w:tcPr>
+          <w:p>
+            <w:pPr>
+              <w:spacing w:after="0" w:line="252"/>
+            </w:pPr>
+            <w:r>
+              <w:rPr>
+                <w:rFonts w:ascii="Arial" w:cs="Arial" w:eastAsia="Arial" w:hAnsi="Arial"/>
+                <w:b w:val="false"/>
+                <w:bCs w:val="false"/>
+                <w:sz w:val="17"/>
+                <w:szCs w:val="17"/>
+              </w:rPr>
+              <w:t xml:space="preserve">По IoU рамок: совпали, спорный класс, только VLM, только детектор</w:t>
+            </w:r>
+          </w:p>
+        </w:tc>
+        <w:tc>
+          <w:tcPr>
+            <w:tcW w:type="dxa" w:w="2699"/>
+            <w:tcMar>
+              <w:top w:type="dxa" w:w="60"/>
+              <w:left w:type="dxa" w:w="90"/>
+              <w:bottom w:type="dxa" w:w="60"/>
+              <w:right w:type="dxa" w:w="90"/>
+            </w:tcMar>
+          </w:tcPr>
+          <w:p>
+            <w:pPr>
+              <w:spacing w:after="0" w:line="252"/>
+            </w:pPr>
+            <w:r>
+              <w:rPr>
+                <w:rFonts w:ascii="Arial" w:cs="Arial" w:eastAsia="Arial" w:hAnsi="Arial"/>
+                <w:b w:val="false"/>
+                <w:bCs w:val="false"/>
+                <w:sz w:val="17"/>
+                <w:szCs w:val="17"/>
+              </w:rPr>
+              <w:t xml:space="preserve">сервис</w:t>
+            </w:r>
+          </w:p>
+        </w:tc>
+      </w:tr>
+      <w:tr>
+        <w:trPr>
+          <w:cantSplit/>
+        </w:trPr>
+        <w:tc>
+          <w:tcPr>
+            <w:tcW w:type="dxa" w:w="2120"/>
+            <w:shd w:fill="FAF8FD" w:color="auto" w:val="clear"/>
+            <w:tcMar>
+              <w:top w:type="dxa" w:w="60"/>
+              <w:left w:type="dxa" w:w="90"/>
+              <w:bottom w:type="dxa" w:w="60"/>
+              <w:right w:type="dxa" w:w="90"/>
+            </w:tcMar>
+          </w:tcPr>
+          <w:p>
+            <w:pPr>
+              <w:spacing w:after="0" w:line="252"/>
+            </w:pPr>
+            <w:r>
+              <w:rPr>
+                <w:rFonts w:ascii="Arial" w:cs="Arial" w:eastAsia="Arial" w:hAnsi="Arial"/>
+                <w:b w:val="false"/>
+                <w:bCs w:val="false"/>
+                <w:sz w:val="17"/>
+                <w:szCs w:val="17"/>
+              </w:rPr>
               <w:t xml:space="preserve">YandexGPT</w:t>
             </w:r>
           </w:p>
@@ -7941,6 +8025,7 @@
         <w:tc>
           <w:tcPr>
             <w:tcW w:type="dxa" w:w="4819"/>
+            <w:shd w:fill="FAF8FD" w:color="auto" w:val="clear"/>
             <w:tcMar>
               <w:top w:type="dxa" w:w="60"/>
               <w:left w:type="dxa" w:w="90"/>
@@ -7967,6 +8052,7 @@
         <w:tc>
           <w:tcPr>
             <w:tcW w:type="dxa" w:w="2699"/>
+            <w:shd w:fill="FAF8FD" w:color="auto" w:val="clear"/>
             <w:tcMar>
               <w:top w:type="dxa" w:w="60"/>
               <w:left w:type="dxa" w:w="90"/>
@@ -8005,7 +8091,7 @@
         <w:rPr>
           <w:rFonts w:ascii="Arial" w:cs="Arial" w:eastAsia="Arial" w:hAnsi="Arial"/>
         </w:rPr>
-        <w:t xml:space="preserve">YandexGPT не принимает изображения, поэтому «глаза» конвейера — детектор, модель готовности и VLM. Модель </w:t>
+        <w:t xml:space="preserve">YandexGPT не принимает изображения, поэтому «глаза» конвейера — детектор, модель готовности, Grounding DINO и VLM. Модель </w:t>
       </w:r>
       <w:r>
         <w:rPr>
@@ -8021,6 +8107,17 @@
           <w:rFonts w:ascii="Arial" w:cs="Arial" w:eastAsia="Arial" w:hAnsi="Arial"/>
         </w:rPr>
         <w:t xml:space="preserve"> из AI Studio получает ещё и сами кадры; Claude и ChatGPT подключаются той же настройкой. Итог сводится по слоям: техника по классам (детектор / VLM / LLM) с расхождениями, стадия по графику, модели, VLM и LLM. «Применить исправления» исключает ложные рамки, исправляет класс и добавляет пропущенную технику, если уверенность LLM не ниже 0,6; правила пересчитываются по снимку и дню, «Отменить» возвращает всё как было. Анализ дня даёт статус площадки, риски срыва сроков с вероятностью, прогноз задержек по этапам и места, где модели и правила, вероятно, ошиблись.</w:t>
+      </w:r>
+    </w:p>
+    <w:p>
+      <w:pPr>
+        <w:spacing w:after="120" w:line="276"/>
+      </w:pPr>
+      <w:r>
+        <w:rPr>
+          <w:rFonts w:ascii="Arial" w:cs="Arial" w:eastAsia="Arial" w:hAnsi="Arial"/>
+        </w:rPr>
+        <w:t xml:space="preserve">Скорость без потери качества: модели загружаются в память сразу после старта; Grounding DINO считает признаки кадра один раз на все подсказки; модели на CPU и запрос к LLM идут в разных потоках, поэтому пока LLM отвечает по одному кадру, модели считают следующий; выводы детерминированных слоёв (модель готовности, Grounding DINO, VLM) кешируются по содержимому кадра — повторный анализ заново вызывает только LLM. Время каждого слоя показывается в карточке.</w:t>
       </w:r>
     </w:p>
     <w:p>
@@ -8250,7 +8347,7 @@
         <w:rPr>
           <w:rFonts w:ascii="Arial" w:cs="Arial" w:eastAsia="Arial" w:hAnsi="Arial"/>
         </w:rPr>
-        <w:t xml:space="preserve"> — 77: движок правил на сценариях (включая пример ТЗ), все демо-сценарии end-to-end, API, детекция по фрагментам и ONNX-декодер, ИИ-конвейер с подменой YandexGPT и VLM (признаки модели готовности сверяются с кодом обучения), сборка датасета и метрики AP50.</w:t>
+        <w:t xml:space="preserve"> — 88: движок правил на сценариях (включая пример ТЗ), все демо-сценарии end-to-end, API, детекция по фрагментам и ONNX-декодер, ИИ-конвейер с подменой YandexGPT и VLM (признаки модели готовности сверяются с кодом обучения), сборка датасета и метрики AP50.</w:t>
       </w:r>
     </w:p>
     <w:p>
@@ -13993,7 +14090,7 @@
           <w:sz w:val="17"/>
           <w:szCs w:val="17"/>
         </w:rPr>
-        <w:t xml:space="preserve">cd backend &amp;&amp; python -m unittest discover -s tests     # 71: движок, сценарии, API, ИИ</w:t>
+        <w:t xml:space="preserve">cd backend &amp;&amp; python -m unittest discover -s tests     # 82: движок, сценарии, API, ИИ</w:t>
       </w:r>
     </w:p>
     <w:p>
@@ -15289,7 +15386,7 @@
                 <w:sz w:val="15"/>
                 <w:szCs w:val="15"/>
               </w:rPr>
-              <w:t xml:space="preserve">OKO_VLM</w:t>
+              <w:t xml:space="preserve">OKO_OPENVOCAB</w:t>
             </w:r>
           </w:p>
         </w:tc>
@@ -15315,7 +15412,7 @@
                 <w:sz w:val="16"/>
                 <w:szCs w:val="16"/>
               </w:rPr>
-              <w:t xml:space="preserve">off</w:t>
+              <w:t xml:space="preserve">auto</w:t>
             </w:r>
           </w:p>
         </w:tc>
@@ -15341,7 +15438,7 @@
                 <w:sz w:val="16"/>
                 <w:szCs w:val="16"/>
               </w:rPr>
-              <w:t xml:space="preserve">auto — Qwen3-VL под память · id модели · off</w:t>
+              <w:t xml:space="preserve">Grounding DINO: auto · id модели · off</w:t>
             </w:r>
           </w:p>
         </w:tc>
@@ -15374,7 +15471,7 @@
                 <w:sz w:val="15"/>
                 <w:szCs w:val="15"/>
               </w:rPr>
-              <w:t xml:space="preserve">OKO_LLM_PROVIDER</w:t>
+              <w:t xml:space="preserve">OKO_VLM</w:t>
             </w:r>
           </w:p>
         </w:tc>
@@ -15428,7 +15525,7 @@
                 <w:sz w:val="16"/>
                 <w:szCs w:val="16"/>
               </w:rPr>
-              <w:t xml:space="preserve">yandex · anthropic · openai</w:t>
+              <w:t xml:space="preserve">auto — Qwen3-VL под память · id модели · off</w:t>
             </w:r>
           </w:p>
         </w:tc>
@@ -15460,7 +15557,7 @@
                 <w:sz w:val="15"/>
                 <w:szCs w:val="15"/>
               </w:rPr>
-              <w:t xml:space="preserve">OKO_LLM_MODEL</w:t>
+              <w:t xml:space="preserve">OKO_LLM_PROVIDER</w:t>
             </w:r>
           </w:p>
         </w:tc>
@@ -15486,7 +15583,7 @@
                 <w:sz w:val="16"/>
                 <w:szCs w:val="16"/>
               </w:rPr>
-              <w:t xml:space="preserve">yandexgpt-5.1</w:t>
+              <w:t xml:space="preserve">off</w:t>
             </w:r>
           </w:p>
         </w:tc>
@@ -15512,7 +15609,7 @@
                 <w:sz w:val="16"/>
                 <w:szCs w:val="16"/>
               </w:rPr>
-              <w:t xml:space="preserve">модель LLM; для yandex — имя в AI Studio или gpt://…</w:t>
+              <w:t xml:space="preserve">yandex · anthropic · openai</w:t>
             </w:r>
           </w:p>
         </w:tc>
@@ -15545,7 +15642,7 @@
                 <w:sz w:val="15"/>
                 <w:szCs w:val="15"/>
               </w:rPr>
-              <w:t xml:space="preserve">OKO_YC_FOLDER_ID</w:t>
+              <w:t xml:space="preserve">OKO_LLM_MODEL</w:t>
             </w:r>
           </w:p>
         </w:tc>
@@ -15572,7 +15669,7 @@
                 <w:sz w:val="16"/>
                 <w:szCs w:val="16"/>
               </w:rPr>
-              <w:t xml:space="preserve">—</w:t>
+              <w:t xml:space="preserve">yandexgpt-5.1</w:t>
             </w:r>
           </w:p>
         </w:tc>
@@ -15599,7 +15696,7 @@
                 <w:sz w:val="16"/>
                 <w:szCs w:val="16"/>
               </w:rPr>
-              <w:t xml:space="preserve">каталог Yandex Cloud для YandexGPT</w:t>
+              <w:t xml:space="preserve">модель LLM; для yandex — имя в AI Studio или gpt://…</w:t>
             </w:r>
           </w:p>
         </w:tc>
@@ -15631,7 +15728,7 @@
                 <w:sz w:val="15"/>
                 <w:szCs w:val="15"/>
               </w:rPr>
-              <w:t xml:space="preserve">OKO_LLM_API_KEY</w:t>
+              <w:t xml:space="preserve">OKO_YC_FOLDER_ID</w:t>
             </w:r>
           </w:p>
         </w:tc>
@@ -15683,7 +15780,7 @@
                 <w:sz w:val="16"/>
                 <w:szCs w:val="16"/>
               </w:rPr>
-              <w:t xml:space="preserve">API-ключ; без него — IAM-токен сервисного аккаунта ВМ</w:t>
+              <w:t xml:space="preserve">каталог Yandex Cloud для YandexGPT</w:t>
             </w:r>
           </w:p>
         </w:tc>
@@ -15716,7 +15813,7 @@
                 <w:sz w:val="15"/>
                 <w:szCs w:val="15"/>
               </w:rPr>
-              <w:t xml:space="preserve">OKO_AI_AUTO</w:t>
+              <w:t xml:space="preserve">OKO_LLM_API_KEY</w:t>
             </w:r>
           </w:p>
         </w:tc>
@@ -15743,7 +15840,7 @@
                 <w:sz w:val="16"/>
                 <w:szCs w:val="16"/>
               </w:rPr>
-              <w:t xml:space="preserve">0</w:t>
+              <w:t xml:space="preserve">—</w:t>
             </w:r>
           </w:p>
         </w:tc>
@@ -15770,7 +15867,7 @@
                 <w:sz w:val="16"/>
                 <w:szCs w:val="16"/>
               </w:rPr>
-              <w:t xml:space="preserve">1 — анализировать каждый новый снимок</w:t>
+              <w:t xml:space="preserve">API-ключ; без него — IAM-токен сервисного аккаунта ВМ</w:t>
             </w:r>
           </w:p>
         </w:tc>
@@ -15802,7 +15899,7 @@
                 <w:sz w:val="15"/>
                 <w:szCs w:val="15"/>
               </w:rPr>
-              <w:t xml:space="preserve">OKO_AI_APPLY</w:t>
+              <w:t xml:space="preserve">OKO_AI_AUTO</w:t>
             </w:r>
           </w:p>
         </w:tc>
@@ -15828,6 +15925,92 @@
                 <w:sz w:val="16"/>
                 <w:szCs w:val="16"/>
               </w:rPr>
+              <w:t xml:space="preserve">0</w:t>
+            </w:r>
+          </w:p>
+        </w:tc>
+        <w:tc>
+          <w:tcPr>
+            <w:tcW w:type="dxa" w:w="3277"/>
+            <w:tcMar>
+              <w:top w:type="dxa" w:w="60"/>
+              <w:left w:type="dxa" w:w="90"/>
+              <w:bottom w:type="dxa" w:w="60"/>
+              <w:right w:type="dxa" w:w="90"/>
+            </w:tcMar>
+          </w:tcPr>
+          <w:p>
+            <w:pPr>
+              <w:spacing w:after="0" w:line="252"/>
+            </w:pPr>
+            <w:r>
+              <w:rPr>
+                <w:rFonts w:ascii="Arial" w:cs="Arial" w:eastAsia="Arial" w:hAnsi="Arial"/>
+                <w:b w:val="false"/>
+                <w:bCs w:val="false"/>
+                <w:sz w:val="16"/>
+                <w:szCs w:val="16"/>
+              </w:rPr>
+              <w:t xml:space="preserve">1 — анализировать каждый новый снимок</w:t>
+            </w:r>
+          </w:p>
+        </w:tc>
+      </w:tr>
+      <w:tr>
+        <w:trPr>
+          <w:cantSplit/>
+        </w:trPr>
+        <w:tc>
+          <w:tcPr>
+            <w:tcW w:type="dxa" w:w="2891"/>
+            <w:shd w:fill="FAF8FD" w:color="auto" w:val="clear"/>
+            <w:tcMar>
+              <w:top w:type="dxa" w:w="60"/>
+              <w:left w:type="dxa" w:w="90"/>
+              <w:bottom w:type="dxa" w:w="60"/>
+              <w:right w:type="dxa" w:w="90"/>
+            </w:tcMar>
+          </w:tcPr>
+          <w:p>
+            <w:pPr>
+              <w:spacing w:after="0" w:line="252"/>
+            </w:pPr>
+            <w:r>
+              <w:rPr>
+                <w:rFonts w:ascii="Courier New" w:cs="Courier New" w:eastAsia="Courier New" w:hAnsi="Courier New"/>
+                <w:b w:val="false"/>
+                <w:bCs w:val="false"/>
+                <w:color w:val="520978"/>
+                <w:sz w:val="15"/>
+                <w:szCs w:val="15"/>
+              </w:rPr>
+              <w:t xml:space="preserve">OKO_AI_APPLY</w:t>
+            </w:r>
+          </w:p>
+        </w:tc>
+        <w:tc>
+          <w:tcPr>
+            <w:tcW w:type="dxa" w:w="3470"/>
+            <w:shd w:fill="FAF8FD" w:color="auto" w:val="clear"/>
+            <w:tcMar>
+              <w:top w:type="dxa" w:w="60"/>
+              <w:left w:type="dxa" w:w="90"/>
+              <w:bottom w:type="dxa" w:w="60"/>
+              <w:right w:type="dxa" w:w="90"/>
+            </w:tcMar>
+          </w:tcPr>
+          <w:p>
+            <w:pPr>
+              <w:spacing w:after="0" w:line="252"/>
+            </w:pPr>
+            <w:r>
+              <w:rPr>
+                <w:rFonts w:ascii="Arial" w:cs="Arial" w:eastAsia="Arial" w:hAnsi="Arial"/>
+                <w:b w:val="false"/>
+                <w:bCs w:val="false"/>
+                <w:sz w:val="16"/>
+                <w:szCs w:val="16"/>
+              </w:rPr>
               <w:t xml:space="preserve">manual</w:t>
             </w:r>
           </w:p>
@@ -15835,6 +16018,7 @@
         <w:tc>
           <w:tcPr>
             <w:tcW w:type="dxa" w:w="3277"/>
+            <w:shd w:fill="FAF8FD" w:color="auto" w:val="clear"/>
             <w:tcMar>
               <w:top w:type="dxa" w:w="60"/>
               <w:left w:type="dxa" w:w="90"/>

</xml_diff>

<commit_message>
AI on test image
</commit_message>
<xml_diff>
--- a/docs/ОКО_документация.docx
+++ b/docs/ОКО_документация.docx
@@ -649,7 +649,7 @@
                 <w:sz w:val="18"/>
                 <w:szCs w:val="18"/>
               </w:rPr>
-              <w:t xml:space="preserve">Сервис: FastAPI, движок правил, детекторы, ИИ-анализ, модель данных, консоль, 84 автотеста, Dockerfile</w:t>
+              <w:t xml:space="preserve">Сервис: FastAPI, движок правил, детекторы, ИИ-анализ, модель данных, консоль, 80 автотестов, Dockerfile</w:t>
             </w:r>
           </w:p>
         </w:tc>
@@ -7765,7 +7765,7 @@
                 <w:sz w:val="17"/>
                 <w:szCs w:val="17"/>
               </w:rPr>
-              <w:t xml:space="preserve">Grounding DINO</w:t>
+              <w:t xml:space="preserve">Локальная VLM</w:t>
             </w:r>
           </w:p>
         </w:tc>
@@ -7791,7 +7791,7 @@
                 <w:sz w:val="17"/>
                 <w:szCs w:val="17"/>
               </w:rPr>
-              <w:t xml:space="preserve">Как в ML-части: прочие объекты по текстовым подсказкам — рабочие, леса, опалубка, строящееся здание, котлован, ограждение; техника одним запросом — подтверждение рамок RF-DETR и кандидаты в пропущенную технику</w:t>
+              <w:t xml:space="preserve">Описание сцены, техника с рамками, стадия, люди, условия съёмки</w:t>
             </w:r>
           </w:p>
         </w:tc>
@@ -7817,7 +7817,7 @@
                 <w:sz w:val="17"/>
                 <w:szCs w:val="17"/>
               </w:rPr>
-              <w:t xml:space="preserve">сервис, CPU; подсказки — methodology/open_vocab.yaml</w:t>
+              <w:t xml:space="preserve">Qwen3-VL 8B → 4B → 2B → SmolVLM2-500M: самая крупная, что помещается в память</w:t>
             </w:r>
           </w:p>
         </w:tc>
@@ -7849,7 +7849,7 @@
                 <w:sz w:val="17"/>
                 <w:szCs w:val="17"/>
               </w:rPr>
-              <w:t xml:space="preserve">Локальная VLM</w:t>
+              <w:t xml:space="preserve">Сверка детектора и VLM</w:t>
             </w:r>
           </w:p>
         </w:tc>
@@ -7876,7 +7876,7 @@
                 <w:sz w:val="17"/>
                 <w:szCs w:val="17"/>
               </w:rPr>
-              <w:t xml:space="preserve">Описание сцены, техника с рамками, стадия, люди, условия съёмки</w:t>
+              <w:t xml:space="preserve">По IoU рамок: совпали, спорный класс, только VLM, только детектор</w:t>
             </w:r>
           </w:p>
         </w:tc>
@@ -7903,7 +7903,7 @@
                 <w:sz w:val="17"/>
                 <w:szCs w:val="17"/>
               </w:rPr>
-              <w:t xml:space="preserve">Qwen3-VL 8B → 4B → 2B → SmolVLM2-500M: самая крупная, что помещается в память</w:t>
+              <w:t xml:space="preserve">сервис</w:t>
             </w:r>
           </w:p>
         </w:tc>
@@ -7934,7 +7934,7 @@
                 <w:sz w:val="17"/>
                 <w:szCs w:val="17"/>
               </w:rPr>
-              <w:t xml:space="preserve">Сверка детектора и VLM</w:t>
+              <w:t xml:space="preserve">YandexGPT</w:t>
             </w:r>
           </w:p>
         </w:tc>
@@ -7960,99 +7960,13 @@
                 <w:sz w:val="17"/>
                 <w:szCs w:val="17"/>
               </w:rPr>
-              <w:t xml:space="preserve">По IoU рамок: совпали, спорный класс, только VLM, только детектор</w:t>
+              <w:t xml:space="preserve">Вердикт по каждой рамке и отклонению, пропущенная техника с рамкой, стадия, новые находки, прогноз, рекомендации — JSON по схеме</w:t>
             </w:r>
           </w:p>
         </w:tc>
         <w:tc>
           <w:tcPr>
             <w:tcW w:type="dxa" w:w="2699"/>
-            <w:tcMar>
-              <w:top w:type="dxa" w:w="60"/>
-              <w:left w:type="dxa" w:w="90"/>
-              <w:bottom w:type="dxa" w:w="60"/>
-              <w:right w:type="dxa" w:w="90"/>
-            </w:tcMar>
-          </w:tcPr>
-          <w:p>
-            <w:pPr>
-              <w:spacing w:after="0" w:line="252"/>
-            </w:pPr>
-            <w:r>
-              <w:rPr>
-                <w:rFonts w:ascii="Arial" w:cs="Arial" w:eastAsia="Arial" w:hAnsi="Arial"/>
-                <w:b w:val="false"/>
-                <w:bCs w:val="false"/>
-                <w:sz w:val="17"/>
-                <w:szCs w:val="17"/>
-              </w:rPr>
-              <w:t xml:space="preserve">сервис</w:t>
-            </w:r>
-          </w:p>
-        </w:tc>
-      </w:tr>
-      <w:tr>
-        <w:trPr>
-          <w:cantSplit/>
-        </w:trPr>
-        <w:tc>
-          <w:tcPr>
-            <w:tcW w:type="dxa" w:w="2120"/>
-            <w:shd w:fill="FAF8FD" w:color="auto" w:val="clear"/>
-            <w:tcMar>
-              <w:top w:type="dxa" w:w="60"/>
-              <w:left w:type="dxa" w:w="90"/>
-              <w:bottom w:type="dxa" w:w="60"/>
-              <w:right w:type="dxa" w:w="90"/>
-            </w:tcMar>
-          </w:tcPr>
-          <w:p>
-            <w:pPr>
-              <w:spacing w:after="0" w:line="252"/>
-            </w:pPr>
-            <w:r>
-              <w:rPr>
-                <w:rFonts w:ascii="Arial" w:cs="Arial" w:eastAsia="Arial" w:hAnsi="Arial"/>
-                <w:b w:val="false"/>
-                <w:bCs w:val="false"/>
-                <w:sz w:val="17"/>
-                <w:szCs w:val="17"/>
-              </w:rPr>
-              <w:t xml:space="preserve">YandexGPT</w:t>
-            </w:r>
-          </w:p>
-        </w:tc>
-        <w:tc>
-          <w:tcPr>
-            <w:tcW w:type="dxa" w:w="4819"/>
-            <w:shd w:fill="FAF8FD" w:color="auto" w:val="clear"/>
-            <w:tcMar>
-              <w:top w:type="dxa" w:w="60"/>
-              <w:left w:type="dxa" w:w="90"/>
-              <w:bottom w:type="dxa" w:w="60"/>
-              <w:right w:type="dxa" w:w="90"/>
-            </w:tcMar>
-          </w:tcPr>
-          <w:p>
-            <w:pPr>
-              <w:spacing w:after="0" w:line="252"/>
-            </w:pPr>
-            <w:r>
-              <w:rPr>
-                <w:rFonts w:ascii="Arial" w:cs="Arial" w:eastAsia="Arial" w:hAnsi="Arial"/>
-                <w:b w:val="false"/>
-                <w:bCs w:val="false"/>
-                <w:sz w:val="17"/>
-                <w:szCs w:val="17"/>
-              </w:rPr>
-              <w:t xml:space="preserve">Вердикт по каждой рамке и отклонению, пропущенная техника с рамкой, стадия, новые находки, прогноз, рекомендации — JSON по схеме</w:t>
-            </w:r>
-          </w:p>
-        </w:tc>
-        <w:tc>
-          <w:tcPr>
-            <w:tcW w:type="dxa" w:w="2699"/>
-            <w:shd w:fill="FAF8FD" w:color="auto" w:val="clear"/>
             <w:tcMar>
               <w:top w:type="dxa" w:w="60"/>
               <w:left w:type="dxa" w:w="90"/>
@@ -8091,7 +8005,7 @@
         <w:rPr>
           <w:rFonts w:ascii="Arial" w:cs="Arial" w:eastAsia="Arial" w:hAnsi="Arial"/>
         </w:rPr>
-        <w:t xml:space="preserve">YandexGPT не принимает изображения, поэтому «глаза» конвейера — детектор, модель готовности, Grounding DINO и VLM. Модель </w:t>
+        <w:t xml:space="preserve">YandexGPT не принимает изображения, поэтому «глаза» конвейера — детектор, модель готовности и VLM. Модель </w:t>
       </w:r>
       <w:r>
         <w:rPr>
@@ -8117,7 +8031,7 @@
         <w:rPr>
           <w:rFonts w:ascii="Arial" w:cs="Arial" w:eastAsia="Arial" w:hAnsi="Arial"/>
         </w:rPr>
-        <w:t xml:space="preserve">Скорость без потери качества: модели загружаются в память сразу после старта; Grounding DINO считает признаки кадра один раз на все подсказки; модели на CPU и запрос к LLM идут в разных потоках, поэтому пока LLM отвечает по одному кадру, модели считают следующий; выводы детерминированных слоёв (модель готовности, Grounding DINO, VLM) кешируются по содержимому кадра — повторный анализ заново вызывает только LLM. Время каждого слоя показывается в карточке.</w:t>
+        <w:t xml:space="preserve">Скорость без потери качества: модели загружаются в память сразу после старта; модели на CPU и запрос к LLM идут в разных потоках, поэтому пока LLM отвечает по одному кадру, модели считают следующий; выводы детерминированных слоёв (модель готовности, VLM) кешируются по содержимому кадра — повторный анализ заново вызывает только LLM. Время каждого слоя показывается в карточке.</w:t>
       </w:r>
     </w:p>
     <w:p>
@@ -13640,7 +13554,7 @@
         <w:rPr>
           <w:rFonts w:ascii="Arial" w:cs="Arial" w:eastAsia="Arial" w:hAnsi="Arial"/>
         </w:rPr>
-        <w:t xml:space="preserve"> — загрузить файл, выбрать вид работ и технику по графику; получить технику, проверки и предупреждения. Свои снимки распознаются с подключёнными весами RF-DETR.</w:t>
+        <w:t xml:space="preserve"> — загрузить файл, выбрать вид работ и технику по графику; получить технику, проверки и предупреждения; анализ ИИ запускается сразу после детекции. Свои снимки распознаются с подключёнными весами RF-DETR.</w:t>
       </w:r>
     </w:p>
     <w:p>
@@ -15386,7 +15300,7 @@
                 <w:sz w:val="15"/>
                 <w:szCs w:val="15"/>
               </w:rPr>
-              <w:t xml:space="preserve">OKO_OPENVOCAB</w:t>
+              <w:t xml:space="preserve">OKO_VLM</w:t>
             </w:r>
           </w:p>
         </w:tc>
@@ -15412,7 +15326,7 @@
                 <w:sz w:val="16"/>
                 <w:szCs w:val="16"/>
               </w:rPr>
-              <w:t xml:space="preserve">auto</w:t>
+              <w:t xml:space="preserve">off</w:t>
             </w:r>
           </w:p>
         </w:tc>
@@ -15438,7 +15352,7 @@
                 <w:sz w:val="16"/>
                 <w:szCs w:val="16"/>
               </w:rPr>
-              <w:t xml:space="preserve">Grounding DINO: auto · id модели · off</w:t>
+              <w:t xml:space="preserve">auto — Qwen3-VL под память · id модели · off</w:t>
             </w:r>
           </w:p>
         </w:tc>
@@ -15471,7 +15385,7 @@
                 <w:sz w:val="15"/>
                 <w:szCs w:val="15"/>
               </w:rPr>
-              <w:t xml:space="preserve">OKO_VLM</w:t>
+              <w:t xml:space="preserve">OKO_LLM_PROVIDER</w:t>
             </w:r>
           </w:p>
         </w:tc>
@@ -15525,7 +15439,7 @@
                 <w:sz w:val="16"/>
                 <w:szCs w:val="16"/>
               </w:rPr>
-              <w:t xml:space="preserve">auto — Qwen3-VL под память · id модели · off</w:t>
+              <w:t xml:space="preserve">yandex · anthropic · openai</w:t>
             </w:r>
           </w:p>
         </w:tc>
@@ -15557,7 +15471,7 @@
                 <w:sz w:val="15"/>
                 <w:szCs w:val="15"/>
               </w:rPr>
-              <w:t xml:space="preserve">OKO_LLM_PROVIDER</w:t>
+              <w:t xml:space="preserve">OKO_LLM_MODEL</w:t>
             </w:r>
           </w:p>
         </w:tc>
@@ -15583,7 +15497,7 @@
                 <w:sz w:val="16"/>
                 <w:szCs w:val="16"/>
               </w:rPr>
-              <w:t xml:space="preserve">off</w:t>
+              <w:t xml:space="preserve">yandexgpt-5.1</w:t>
             </w:r>
           </w:p>
         </w:tc>
@@ -15609,7 +15523,7 @@
                 <w:sz w:val="16"/>
                 <w:szCs w:val="16"/>
               </w:rPr>
-              <w:t xml:space="preserve">yandex · anthropic · openai</w:t>
+              <w:t xml:space="preserve">модель LLM; для yandex — имя в AI Studio или gpt://…</w:t>
             </w:r>
           </w:p>
         </w:tc>
@@ -15642,7 +15556,7 @@
                 <w:sz w:val="15"/>
                 <w:szCs w:val="15"/>
               </w:rPr>
-              <w:t xml:space="preserve">OKO_LLM_MODEL</w:t>
+              <w:t xml:space="preserve">OKO_YC_FOLDER_ID</w:t>
             </w:r>
           </w:p>
         </w:tc>
@@ -15669,7 +15583,7 @@
                 <w:sz w:val="16"/>
                 <w:szCs w:val="16"/>
               </w:rPr>
-              <w:t xml:space="preserve">yandexgpt-5.1</w:t>
+              <w:t xml:space="preserve">—</w:t>
             </w:r>
           </w:p>
         </w:tc>
@@ -15696,7 +15610,7 @@
                 <w:sz w:val="16"/>
                 <w:szCs w:val="16"/>
               </w:rPr>
-              <w:t xml:space="preserve">модель LLM; для yandex — имя в AI Studio или gpt://…</w:t>
+              <w:t xml:space="preserve">каталог Yandex Cloud для YandexGPT</w:t>
             </w:r>
           </w:p>
         </w:tc>
@@ -15728,7 +15642,7 @@
                 <w:sz w:val="15"/>
                 <w:szCs w:val="15"/>
               </w:rPr>
-              <w:t xml:space="preserve">OKO_YC_FOLDER_ID</w:t>
+              <w:t xml:space="preserve">OKO_LLM_API_KEY</w:t>
             </w:r>
           </w:p>
         </w:tc>
@@ -15780,7 +15694,7 @@
                 <w:sz w:val="16"/>
                 <w:szCs w:val="16"/>
               </w:rPr>
-              <w:t xml:space="preserve">каталог Yandex Cloud для YandexGPT</w:t>
+              <w:t xml:space="preserve">API-ключ; без него — IAM-токен сервисного аккаунта ВМ</w:t>
             </w:r>
           </w:p>
         </w:tc>
@@ -15813,7 +15727,7 @@
                 <w:sz w:val="15"/>
                 <w:szCs w:val="15"/>
               </w:rPr>
-              <w:t xml:space="preserve">OKO_LLM_API_KEY</w:t>
+              <w:t xml:space="preserve">OKO_AI_AUTO</w:t>
             </w:r>
           </w:p>
         </w:tc>
@@ -15840,7 +15754,7 @@
                 <w:sz w:val="16"/>
                 <w:szCs w:val="16"/>
               </w:rPr>
-              <w:t xml:space="preserve">—</w:t>
+              <w:t xml:space="preserve">0</w:t>
             </w:r>
           </w:p>
         </w:tc>
@@ -15867,7 +15781,7 @@
                 <w:sz w:val="16"/>
                 <w:szCs w:val="16"/>
               </w:rPr>
-              <w:t xml:space="preserve">API-ключ; без него — IAM-токен сервисного аккаунта ВМ</w:t>
+              <w:t xml:space="preserve">1 — анализировать каждый новый снимок</w:t>
             </w:r>
           </w:p>
         </w:tc>
@@ -15899,7 +15813,7 @@
                 <w:sz w:val="15"/>
                 <w:szCs w:val="15"/>
               </w:rPr>
-              <w:t xml:space="preserve">OKO_AI_AUTO</w:t>
+              <w:t xml:space="preserve">OKO_AI_APPLY</w:t>
             </w:r>
           </w:p>
         </w:tc>
@@ -15925,100 +15839,13 @@
                 <w:sz w:val="16"/>
                 <w:szCs w:val="16"/>
               </w:rPr>
-              <w:t xml:space="preserve">0</w:t>
+              <w:t xml:space="preserve">manual</w:t>
             </w:r>
           </w:p>
         </w:tc>
         <w:tc>
           <w:tcPr>
             <w:tcW w:type="dxa" w:w="3277"/>
-            <w:tcMar>
-              <w:top w:type="dxa" w:w="60"/>
-              <w:left w:type="dxa" w:w="90"/>
-              <w:bottom w:type="dxa" w:w="60"/>
-              <w:right w:type="dxa" w:w="90"/>
-            </w:tcMar>
-          </w:tcPr>
-          <w:p>
-            <w:pPr>
-              <w:spacing w:after="0" w:line="252"/>
-            </w:pPr>
-            <w:r>
-              <w:rPr>
-                <w:rFonts w:ascii="Arial" w:cs="Arial" w:eastAsia="Arial" w:hAnsi="Arial"/>
-                <w:b w:val="false"/>
-                <w:bCs w:val="false"/>
-                <w:sz w:val="16"/>
-                <w:szCs w:val="16"/>
-              </w:rPr>
-              <w:t xml:space="preserve">1 — анализировать каждый новый снимок</w:t>
-            </w:r>
-          </w:p>
-        </w:tc>
-      </w:tr>
-      <w:tr>
-        <w:trPr>
-          <w:cantSplit/>
-        </w:trPr>
-        <w:tc>
-          <w:tcPr>
-            <w:tcW w:type="dxa" w:w="2891"/>
-            <w:shd w:fill="FAF8FD" w:color="auto" w:val="clear"/>
-            <w:tcMar>
-              <w:top w:type="dxa" w:w="60"/>
-              <w:left w:type="dxa" w:w="90"/>
-              <w:bottom w:type="dxa" w:w="60"/>
-              <w:right w:type="dxa" w:w="90"/>
-            </w:tcMar>
-          </w:tcPr>
-          <w:p>
-            <w:pPr>
-              <w:spacing w:after="0" w:line="252"/>
-            </w:pPr>
-            <w:r>
-              <w:rPr>
-                <w:rFonts w:ascii="Courier New" w:cs="Courier New" w:eastAsia="Courier New" w:hAnsi="Courier New"/>
-                <w:b w:val="false"/>
-                <w:bCs w:val="false"/>
-                <w:color w:val="520978"/>
-                <w:sz w:val="15"/>
-                <w:szCs w:val="15"/>
-              </w:rPr>
-              <w:t xml:space="preserve">OKO_AI_APPLY</w:t>
-            </w:r>
-          </w:p>
-        </w:tc>
-        <w:tc>
-          <w:tcPr>
-            <w:tcW w:type="dxa" w:w="3470"/>
-            <w:shd w:fill="FAF8FD" w:color="auto" w:val="clear"/>
-            <w:tcMar>
-              <w:top w:type="dxa" w:w="60"/>
-              <w:left w:type="dxa" w:w="90"/>
-              <w:bottom w:type="dxa" w:w="60"/>
-              <w:right w:type="dxa" w:w="90"/>
-            </w:tcMar>
-          </w:tcPr>
-          <w:p>
-            <w:pPr>
-              <w:spacing w:after="0" w:line="252"/>
-            </w:pPr>
-            <w:r>
-              <w:rPr>
-                <w:rFonts w:ascii="Arial" w:cs="Arial" w:eastAsia="Arial" w:hAnsi="Arial"/>
-                <w:b w:val="false"/>
-                <w:bCs w:val="false"/>
-                <w:sz w:val="16"/>
-                <w:szCs w:val="16"/>
-              </w:rPr>
-              <w:t xml:space="preserve">manual</w:t>
-            </w:r>
-          </w:p>
-        </w:tc>
-        <w:tc>
-          <w:tcPr>
-            <w:tcW w:type="dxa" w:w="3277"/>
-            <w:shd w:fill="FAF8FD" w:color="auto" w:val="clear"/>
             <w:tcMar>
               <w:top w:type="dxa" w:w="60"/>
               <w:left w:type="dxa" w:w="90"/>

</xml_diff>